<commit_message>
docs: add team workload row expansion bug to analytics round 2 QA
The chevron on each Team workload row toggles aria-expanded between
true and false but no drill-down panel renders below. Flagged as new
HIGH open gap (#3) with two paths forward: wire up the panel or pull
the chevron. Updated subtitle + summary counts to reflect the new gap.

Co-Authored-By: Claude Opus 4.7 <noreply@anthropic.com>
</commit_message>
<xml_diff>
--- a/docs/qa-comparison/analytics-page-qa-round2.docx
+++ b/docs/qa-comparison/analytics-page-qa-round2.docx
@@ -55,7 +55,7 @@
           <w:color w:val="5A5A5A"/>
           <w:sz w:val="24"/>
         </w:rPr>
-        <w:t>Round 2 status: the single Round 1 item is done at the display layer. One small follow-up worth flagging: the data feeding the labels still uses generic access roles (team_member / admin / manager) rather than the richer job titles our build uses. Display formatting is correct; the underlying data is the lingering question.</w:t>
+        <w:t>Round 2 status: the single Round 1 item is done at the display layer. Two follow-ups worth flagging: the data feeding the labels still uses generic access roles (team_member / admin / manager) rather than the richer job titles our build uses, and a Team workload row expansion control toggles state but renders no drill-down content underneath. Display formatting is correct; the underlying data and the missing expansion panel are the lingering questions.</w:t>
       </w:r>
     </w:p>
     <w:p>
@@ -68,7 +68,7 @@
           <w:color w:val="5A5A5A"/>
           <w:sz w:val="22"/>
         </w:rPr>
-        <w:t>Round 1 items: 1 done · 0 partial · 0 open · 1 follow-up</w:t>
+        <w:t>Round 1 items: 1 done · 1 open · 1 follow-up</w:t>
       </w:r>
     </w:p>
     <w:p>
@@ -470,6 +470,170 @@
         <w:spacing w:after="40"/>
       </w:pPr>
     </w:p>
+    <w:tbl>
+      <w:tblPr>
+        <w:tblW w:type="auto" w:w="0"/>
+        <w:tblLayout w:type="fixed"/>
+        <w:tblLook w:firstColumn="1" w:firstRow="1" w:lastColumn="0" w:lastRow="0" w:noHBand="0" w:noVBand="1" w:val="04A0"/>
+      </w:tblPr>
+      <w:tblGrid>
+        <w:gridCol w:w="792"/>
+        <w:gridCol w:w="1224"/>
+        <w:gridCol w:w="8064"/>
+      </w:tblGrid>
+      <w:tr>
+        <w:trPr>
+          <w:trHeight w:val="312"/>
+        </w:trPr>
+        <w:tc>
+          <w:tcPr>
+            <w:tcW w:type="dxa" w:w="792"/>
+            <w:tcBorders>
+              <w:top w:val="nil"/>
+              <w:left w:val="nil"/>
+              <w:bottom w:val="nil"/>
+              <w:right w:val="nil"/>
+            </w:tcBorders>
+            <w:shd w:val="clear" w:color="auto" w:fill="D33B3B"/>
+            <w:vAlign w:val="center"/>
+          </w:tcPr>
+          <w:p>
+            <w:pPr>
+              <w:spacing w:after="0"/>
+              <w:jc w:val="center"/>
+            </w:pPr>
+            <w:r>
+              <w:rPr>
+                <w:b/>
+                <w:color w:val="FFFFFF"/>
+                <w:sz w:val="16"/>
+              </w:rPr>
+              <w:t>HIGH</w:t>
+            </w:r>
+          </w:p>
+        </w:tc>
+        <w:tc>
+          <w:tcPr>
+            <w:tcW w:type="dxa" w:w="1224"/>
+            <w:tcBorders>
+              <w:top w:val="nil"/>
+              <w:left w:val="nil"/>
+              <w:bottom w:val="nil"/>
+              <w:right w:val="nil"/>
+            </w:tcBorders>
+            <w:shd w:val="clear" w:color="auto" w:fill="D33B3B"/>
+            <w:vAlign w:val="center"/>
+          </w:tcPr>
+          <w:p>
+            <w:pPr>
+              <w:spacing w:after="0"/>
+              <w:jc w:val="center"/>
+            </w:pPr>
+            <w:r>
+              <w:rPr>
+                <w:b/>
+                <w:color w:val="FFFFFF"/>
+                <w:sz w:val="16"/>
+              </w:rPr>
+              <w:t>OPEN</w:t>
+            </w:r>
+          </w:p>
+        </w:tc>
+        <w:tc>
+          <w:tcPr>
+            <w:tcW w:type="dxa" w:w="8064"/>
+            <w:tcBorders>
+              <w:top w:val="nil"/>
+              <w:left w:val="nil"/>
+              <w:bottom w:val="nil"/>
+              <w:right w:val="nil"/>
+            </w:tcBorders>
+            <w:vAlign w:val="center"/>
+          </w:tcPr>
+          <w:p>
+            <w:pPr>
+              <w:spacing w:after="0"/>
+            </w:pPr>
+            <w:r>
+              <w:rPr>
+                <w:b/>
+                <w:color w:val="1A1A1A"/>
+                <w:sz w:val="22"/>
+              </w:rPr>
+              <w:t>#3. Team workload row expansion toggles state but renders no drill-down</w:t>
+            </w:r>
+          </w:p>
+        </w:tc>
+      </w:tr>
+    </w:tbl>
+    <w:p>
+      <w:pPr>
+        <w:spacing w:after="60"/>
+        <w:ind w:left="230"/>
+      </w:pPr>
+      <w:r>
+        <w:rPr>
+          <w:b/>
+          <w:color w:val="1A1A1A"/>
+          <w:sz w:val="20"/>
+        </w:rPr>
+        <w:t xml:space="preserve">Round 1: </w:t>
+      </w:r>
+      <w:r>
+        <w:rPr>
+          <w:color w:val="1A1A1A"/>
+          <w:sz w:val="20"/>
+        </w:rPr>
+        <w:t>Not flagged in Round 1 (the row-expansion affordance was missed during the first pass).</w:t>
+      </w:r>
+    </w:p>
+    <w:p>
+      <w:pPr>
+        <w:spacing w:after="60"/>
+        <w:ind w:left="230"/>
+      </w:pPr>
+      <w:r>
+        <w:rPr>
+          <w:b/>
+          <w:color w:val="1A1A1A"/>
+          <w:sz w:val="20"/>
+        </w:rPr>
+        <w:t xml:space="preserve">Round 2: </w:t>
+      </w:r>
+      <w:r>
+        <w:rPr>
+          <w:color w:val="1A1A1A"/>
+          <w:sz w:val="20"/>
+        </w:rPr>
+        <w:t>Each Team workload row has a chevron on the right (▼ collapsed, ▶ expanded) that hovers in on the row. Clicking the chevron flips the chevron direction and toggles aria-expanded between "true" and "false" on the button, but no drill-down panel renders below the row. The next DOM sibling of the row button is the next member's row button, with no expansion content in between. Verified on Harvey San Juan (589 tasks): aria-expanded becomes "true" but nothing appears underneath. The control implies a drill-down feature that isn't wired up.</w:t>
+      </w:r>
+    </w:p>
+    <w:p>
+      <w:pPr>
+        <w:spacing w:after="60"/>
+        <w:ind w:left="230"/>
+      </w:pPr>
+      <w:r>
+        <w:rPr>
+          <w:b/>
+          <w:color w:val="1A1A1A"/>
+          <w:sz w:val="20"/>
+        </w:rPr>
+        <w:t xml:space="preserve">What's left: </w:t>
+      </w:r>
+      <w:r>
+        <w:rPr>
+          <w:color w:val="1A1A1A"/>
+          <w:sz w:val="20"/>
+        </w:rPr>
+        <w:t>Either wire up the expansion panel or remove the chevron until the panel is ready. If shipping the panel: render the member's open tasks underneath the row when expanded, grouped by client · service, with each task showing title, status pill (TO DO / IN PROGRESS / WAITING), due date, and a quick link to open the card. Limit to 10 tasks initially with a "see all 589" link. If pulling the chevron: drop the button entirely from the row template so the affordance doesn't lie about what's behind it.</w:t>
+      </w:r>
+    </w:p>
+    <w:p>
+      <w:pPr>
+        <w:spacing w:after="40"/>
+      </w:pPr>
+    </w:p>
     <w:p>
       <w:r>
         <w:br w:type="page"/>
@@ -614,6 +778,122 @@
                 <w:sz w:val="20"/>
               </w:rPr>
               <w:t>Phase 2 work, mostly data not UI: build out a Job Titles catalog for the workspace, assign each team member to a title, render that title where role labels currently surface (Team workload, Anyone dropdown, Team Capacity heatmap, Client About &gt; Project Team). The display layer already supports rich labels. It's a matter of plumbing the catalog through.</w:t>
+            </w:r>
+          </w:p>
+        </w:tc>
+      </w:tr>
+    </w:tbl>
+    <w:p>
+      <w:pPr>
+        <w:spacing w:after="80"/>
+      </w:pPr>
+    </w:p>
+    <w:tbl>
+      <w:tblPr>
+        <w:tblW w:type="auto" w:w="0"/>
+        <w:tblLayout w:type="fixed"/>
+        <w:tblLook w:firstColumn="1" w:firstRow="1" w:lastColumn="0" w:lastRow="0" w:noHBand="0" w:noVBand="1" w:val="04A0"/>
+      </w:tblPr>
+      <w:tblGrid>
+        <w:gridCol w:w="461"/>
+        <w:gridCol w:w="792"/>
+        <w:gridCol w:w="8539"/>
+      </w:tblGrid>
+      <w:tr>
+        <w:tc>
+          <w:tcPr>
+            <w:tcW w:type="dxa" w:w="461"/>
+            <w:tcBorders>
+              <w:top w:val="nil"/>
+              <w:left w:val="nil"/>
+              <w:bottom w:val="nil"/>
+              <w:right w:val="nil"/>
+            </w:tcBorders>
+            <w:vAlign w:val="top"/>
+          </w:tcPr>
+          <w:p>
+            <w:pPr>
+              <w:spacing w:after="0"/>
+            </w:pPr>
+            <w:sdt>
+              <w:sdtPr>
+                <w14:checkbox>
+                  <w14:checked w14:val="0"/>
+                  <w14:checkedState w14:val="2612" w14:font="MS Gothic"/>
+                  <w14:uncheckedState w14:val="2610" w14:font="MS Gothic"/>
+                </w14:checkbox>
+              </w:sdtPr>
+              <w:sdtContent>
+                <w:r>
+                  <w:rPr>
+                    <w:rFonts w:ascii="MS Gothic" w:hAnsi="MS Gothic" w:eastAsia="MS Gothic"/>
+                    <w:sz w:val="24"/>
+                  </w:rPr>
+                  <w:t>☐</w:t>
+                </w:r>
+              </w:sdtContent>
+            </w:sdt>
+          </w:p>
+        </w:tc>
+        <w:tc>
+          <w:tcPr>
+            <w:tcW w:type="dxa" w:w="792"/>
+            <w:tcBorders>
+              <w:top w:val="nil"/>
+              <w:left w:val="nil"/>
+              <w:bottom w:val="nil"/>
+              <w:right w:val="nil"/>
+            </w:tcBorders>
+            <w:shd w:val="clear" w:color="auto" w:fill="D33B3B"/>
+            <w:vAlign w:val="top"/>
+          </w:tcPr>
+          <w:p>
+            <w:pPr>
+              <w:spacing w:after="0"/>
+              <w:jc w:val="center"/>
+            </w:pPr>
+            <w:r>
+              <w:rPr>
+                <w:b/>
+                <w:color w:val="FFFFFF"/>
+                <w:sz w:val="16"/>
+              </w:rPr>
+              <w:t>HIGH</w:t>
+            </w:r>
+          </w:p>
+        </w:tc>
+        <w:tc>
+          <w:tcPr>
+            <w:tcW w:type="dxa" w:w="8539"/>
+            <w:tcBorders>
+              <w:top w:val="nil"/>
+              <w:left w:val="nil"/>
+              <w:bottom w:val="nil"/>
+              <w:right w:val="nil"/>
+            </w:tcBorders>
+            <w:vAlign w:val="top"/>
+          </w:tcPr>
+          <w:p>
+            <w:pPr>
+              <w:spacing w:after="0"/>
+            </w:pPr>
+            <w:r>
+              <w:rPr>
+                <w:b/>
+                <w:color w:val="1A1A1A"/>
+                <w:sz w:val="21"/>
+              </w:rPr>
+              <w:t>#3. Team workload row expansion toggles state but renders no drill-down</w:t>
+            </w:r>
+            <w:r>
+              <w:br/>
+            </w:r>
+            <w:r>
+              <w:rPr>
+                <w:color w:val="1A1A1A"/>
+                <w:sz w:val="20"/>
+              </w:rPr>
+              <w:t>Either wire up the expansion panel or remove the chevron until the panel is ready. If shipping the panel: render the member's open tasks underneath the row when expanded, grouped by client · service, with each task showing title, status pill (TO DO / IN PROGRESS / WAITING), due date, and a quick link to open the card. Limit to 10 tasks initially with a "see all 589" link. If pulling the chevron: drop the button entirely from the row template so the affordance doesn't lie about what's behind it.</w:t>
             </w:r>
           </w:p>
         </w:tc>

</xml_diff>

<commit_message>
docs: regroup round 2 QA docs by status (Still open / Done / FYI)
Items now bucket into three sections so the dev's punch list reads
first: Still open (OPEN + PARTIAL items, what they need to ship), then
Done (round 1 items they closed), then For your awareness (INFO items,
no action needed). Original item numbers stay stable across rounds so
cross-referencing to round 1 keeps working. Items surfaced fresh in
round 2 carry a small [NEW] chip so the dev can tell at a glance which
items came in late.

Also swapped the chevron unicode arrows in the analytics doc for
plain-language descriptions so they render correctly in the PDF font.

Co-Authored-By: Claude Opus 4.7 <noreply@anthropic.com>
</commit_message>
<xml_diff>
--- a/docs/qa-comparison/analytics-page-qa-round2.docx
+++ b/docs/qa-comparison/analytics-page-qa-round2.docx
@@ -107,7 +107,7 @@
           <w:color w:val="0077C8"/>
           <w:sz w:val="30"/>
         </w:rPr>
-        <w:t>Round 1 items: status update</w:t>
+        <w:t>Still open</w:t>
       </w:r>
     </w:p>
     <w:p>
@@ -127,7 +127,424 @@
           <w:color w:val="1A1A1A"/>
           <w:sz w:val="21"/>
         </w:rPr>
-        <w:t>Each Round 1 item walked through with what shipped vs what's still missing. Items marked OPEN or PARTIAL roll up into the build checklist at the end.</w:t>
+        <w:t>What the dev still needs to ship. Items tagged [NEW] surfaced during round 2 and weren't on the round 1 list.</w:t>
+      </w:r>
+    </w:p>
+    <w:tbl>
+      <w:tblPr>
+        <w:tblW w:type="auto" w:w="0"/>
+        <w:tblLayout w:type="fixed"/>
+        <w:tblLook w:firstColumn="1" w:firstRow="1" w:lastColumn="0" w:lastRow="0" w:noHBand="0" w:noVBand="1" w:val="04A0"/>
+      </w:tblPr>
+      <w:tblGrid>
+        <w:gridCol w:w="792"/>
+        <w:gridCol w:w="1224"/>
+        <w:gridCol w:w="648"/>
+        <w:gridCol w:w="7416"/>
+      </w:tblGrid>
+      <w:tr>
+        <w:trPr>
+          <w:trHeight w:val="312"/>
+        </w:trPr>
+        <w:tc>
+          <w:tcPr>
+            <w:tcW w:type="dxa" w:w="792"/>
+            <w:tcBorders>
+              <w:top w:val="nil"/>
+              <w:left w:val="nil"/>
+              <w:bottom w:val="nil"/>
+              <w:right w:val="nil"/>
+            </w:tcBorders>
+            <w:shd w:val="clear" w:color="auto" w:fill="4A8F4A"/>
+            <w:vAlign w:val="center"/>
+          </w:tcPr>
+          <w:p>
+            <w:pPr>
+              <w:spacing w:after="0"/>
+              <w:jc w:val="center"/>
+            </w:pPr>
+            <w:r>
+              <w:rPr>
+                <w:b/>
+                <w:color w:val="FFFFFF"/>
+                <w:sz w:val="16"/>
+              </w:rPr>
+              <w:t>LOW</w:t>
+            </w:r>
+          </w:p>
+        </w:tc>
+        <w:tc>
+          <w:tcPr>
+            <w:tcW w:type="dxa" w:w="1224"/>
+            <w:tcBorders>
+              <w:top w:val="nil"/>
+              <w:left w:val="nil"/>
+              <w:bottom w:val="nil"/>
+              <w:right w:val="nil"/>
+            </w:tcBorders>
+            <w:shd w:val="clear" w:color="auto" w:fill="D33B3B"/>
+            <w:vAlign w:val="center"/>
+          </w:tcPr>
+          <w:p>
+            <w:pPr>
+              <w:spacing w:after="0"/>
+              <w:jc w:val="center"/>
+            </w:pPr>
+            <w:r>
+              <w:rPr>
+                <w:b/>
+                <w:color w:val="FFFFFF"/>
+                <w:sz w:val="16"/>
+              </w:rPr>
+              <w:t>OPEN</w:t>
+            </w:r>
+          </w:p>
+        </w:tc>
+        <w:tc>
+          <w:tcPr>
+            <w:tcW w:type="dxa" w:w="648"/>
+            <w:tcBorders>
+              <w:top w:val="nil"/>
+              <w:left w:val="nil"/>
+              <w:bottom w:val="nil"/>
+              <w:right w:val="nil"/>
+            </w:tcBorders>
+            <w:shd w:val="clear" w:color="auto" w:fill="0077C8"/>
+            <w:vAlign w:val="center"/>
+          </w:tcPr>
+          <w:p>
+            <w:pPr>
+              <w:spacing w:after="0"/>
+              <w:jc w:val="center"/>
+            </w:pPr>
+            <w:r>
+              <w:rPr>
+                <w:b/>
+                <w:color w:val="FFFFFF"/>
+                <w:sz w:val="16"/>
+              </w:rPr>
+              <w:t>NEW</w:t>
+            </w:r>
+          </w:p>
+        </w:tc>
+        <w:tc>
+          <w:tcPr>
+            <w:tcW w:type="dxa" w:w="7416"/>
+            <w:tcBorders>
+              <w:top w:val="nil"/>
+              <w:left w:val="nil"/>
+              <w:bottom w:val="nil"/>
+              <w:right w:val="nil"/>
+            </w:tcBorders>
+            <w:vAlign w:val="center"/>
+          </w:tcPr>
+          <w:p>
+            <w:pPr>
+              <w:spacing w:after="0"/>
+            </w:pPr>
+            <w:r>
+              <w:rPr>
+                <w:b/>
+                <w:color w:val="1A1A1A"/>
+                <w:sz w:val="22"/>
+              </w:rPr>
+              <w:t>#2. Underlying labels use generic roles, not job titles</w:t>
+            </w:r>
+          </w:p>
+        </w:tc>
+      </w:tr>
+    </w:tbl>
+    <w:p>
+      <w:pPr>
+        <w:spacing w:after="60"/>
+        <w:ind w:left="230"/>
+      </w:pPr>
+      <w:r>
+        <w:rPr>
+          <w:b/>
+          <w:color w:val="1A1A1A"/>
+          <w:sz w:val="20"/>
+        </w:rPr>
+        <w:t xml:space="preserve">Round 1: </w:t>
+      </w:r>
+      <w:r>
+        <w:rPr>
+          <w:color w:val="1A1A1A"/>
+          <w:sz w:val="20"/>
+        </w:rPr>
+        <w:t>Not flagged in Round 1 (the formatting issue dominated).</w:t>
+      </w:r>
+    </w:p>
+    <w:p>
+      <w:pPr>
+        <w:spacing w:after="60"/>
+        <w:ind w:left="230"/>
+      </w:pPr>
+      <w:r>
+        <w:rPr>
+          <w:b/>
+          <w:color w:val="1A1A1A"/>
+          <w:sz w:val="20"/>
+        </w:rPr>
+        <w:t xml:space="preserve">Round 2: </w:t>
+      </w:r>
+      <w:r>
+        <w:rPr>
+          <w:color w:val="1A1A1A"/>
+          <w:sz w:val="20"/>
+        </w:rPr>
+        <w:t>Now that the display is fixed, a softer issue surfaces: the labels (Team Member, Manager, Admin, SEO Specialist) come from the user's access role, not a Job Titles catalog. Our build maps members to richer job titles (Account Manager, Web Designer, Senior Growth &amp; SEO Manager, Paid Social Manager, Operations Manager). The portal's data layer doesn't have a Job Titles catalog populated yet.</w:t>
+      </w:r>
+    </w:p>
+    <w:p>
+      <w:pPr>
+        <w:spacing w:after="60"/>
+        <w:ind w:left="230"/>
+      </w:pPr>
+      <w:r>
+        <w:rPr>
+          <w:b/>
+          <w:color w:val="1A1A1A"/>
+          <w:sz w:val="20"/>
+        </w:rPr>
+        <w:t xml:space="preserve">What's left: </w:t>
+      </w:r>
+      <w:r>
+        <w:rPr>
+          <w:color w:val="1A1A1A"/>
+          <w:sz w:val="20"/>
+        </w:rPr>
+        <w:t>Phase 2 work, mostly data not UI: build out a Job Titles catalog for the workspace, assign each team member to a title, render that title where role labels currently surface (Team workload, Anyone dropdown, Team Capacity heatmap, Client About &gt; Project Team). The display layer already supports rich labels. It's a matter of plumbing the catalog through.</w:t>
+      </w:r>
+    </w:p>
+    <w:p>
+      <w:pPr>
+        <w:spacing w:after="40"/>
+      </w:pPr>
+    </w:p>
+    <w:tbl>
+      <w:tblPr>
+        <w:tblW w:type="auto" w:w="0"/>
+        <w:tblLayout w:type="fixed"/>
+        <w:tblLook w:firstColumn="1" w:firstRow="1" w:lastColumn="0" w:lastRow="0" w:noHBand="0" w:noVBand="1" w:val="04A0"/>
+      </w:tblPr>
+      <w:tblGrid>
+        <w:gridCol w:w="792"/>
+        <w:gridCol w:w="1224"/>
+        <w:gridCol w:w="648"/>
+        <w:gridCol w:w="7416"/>
+      </w:tblGrid>
+      <w:tr>
+        <w:trPr>
+          <w:trHeight w:val="312"/>
+        </w:trPr>
+        <w:tc>
+          <w:tcPr>
+            <w:tcW w:type="dxa" w:w="792"/>
+            <w:tcBorders>
+              <w:top w:val="nil"/>
+              <w:left w:val="nil"/>
+              <w:bottom w:val="nil"/>
+              <w:right w:val="nil"/>
+            </w:tcBorders>
+            <w:shd w:val="clear" w:color="auto" w:fill="D33B3B"/>
+            <w:vAlign w:val="center"/>
+          </w:tcPr>
+          <w:p>
+            <w:pPr>
+              <w:spacing w:after="0"/>
+              <w:jc w:val="center"/>
+            </w:pPr>
+            <w:r>
+              <w:rPr>
+                <w:b/>
+                <w:color w:val="FFFFFF"/>
+                <w:sz w:val="16"/>
+              </w:rPr>
+              <w:t>HIGH</w:t>
+            </w:r>
+          </w:p>
+        </w:tc>
+        <w:tc>
+          <w:tcPr>
+            <w:tcW w:type="dxa" w:w="1224"/>
+            <w:tcBorders>
+              <w:top w:val="nil"/>
+              <w:left w:val="nil"/>
+              <w:bottom w:val="nil"/>
+              <w:right w:val="nil"/>
+            </w:tcBorders>
+            <w:shd w:val="clear" w:color="auto" w:fill="D33B3B"/>
+            <w:vAlign w:val="center"/>
+          </w:tcPr>
+          <w:p>
+            <w:pPr>
+              <w:spacing w:after="0"/>
+              <w:jc w:val="center"/>
+            </w:pPr>
+            <w:r>
+              <w:rPr>
+                <w:b/>
+                <w:color w:val="FFFFFF"/>
+                <w:sz w:val="16"/>
+              </w:rPr>
+              <w:t>OPEN</w:t>
+            </w:r>
+          </w:p>
+        </w:tc>
+        <w:tc>
+          <w:tcPr>
+            <w:tcW w:type="dxa" w:w="648"/>
+            <w:tcBorders>
+              <w:top w:val="nil"/>
+              <w:left w:val="nil"/>
+              <w:bottom w:val="nil"/>
+              <w:right w:val="nil"/>
+            </w:tcBorders>
+            <w:shd w:val="clear" w:color="auto" w:fill="0077C8"/>
+            <w:vAlign w:val="center"/>
+          </w:tcPr>
+          <w:p>
+            <w:pPr>
+              <w:spacing w:after="0"/>
+              <w:jc w:val="center"/>
+            </w:pPr>
+            <w:r>
+              <w:rPr>
+                <w:b/>
+                <w:color w:val="FFFFFF"/>
+                <w:sz w:val="16"/>
+              </w:rPr>
+              <w:t>NEW</w:t>
+            </w:r>
+          </w:p>
+        </w:tc>
+        <w:tc>
+          <w:tcPr>
+            <w:tcW w:type="dxa" w:w="7416"/>
+            <w:tcBorders>
+              <w:top w:val="nil"/>
+              <w:left w:val="nil"/>
+              <w:bottom w:val="nil"/>
+              <w:right w:val="nil"/>
+            </w:tcBorders>
+            <w:vAlign w:val="center"/>
+          </w:tcPr>
+          <w:p>
+            <w:pPr>
+              <w:spacing w:after="0"/>
+            </w:pPr>
+            <w:r>
+              <w:rPr>
+                <w:b/>
+                <w:color w:val="1A1A1A"/>
+                <w:sz w:val="22"/>
+              </w:rPr>
+              <w:t>#3. Team workload row expansion toggles state but renders no drill-down</w:t>
+            </w:r>
+          </w:p>
+        </w:tc>
+      </w:tr>
+    </w:tbl>
+    <w:p>
+      <w:pPr>
+        <w:spacing w:after="60"/>
+        <w:ind w:left="230"/>
+      </w:pPr>
+      <w:r>
+        <w:rPr>
+          <w:b/>
+          <w:color w:val="1A1A1A"/>
+          <w:sz w:val="20"/>
+        </w:rPr>
+        <w:t xml:space="preserve">Round 1: </w:t>
+      </w:r>
+      <w:r>
+        <w:rPr>
+          <w:color w:val="1A1A1A"/>
+          <w:sz w:val="20"/>
+        </w:rPr>
+        <w:t>Not flagged in Round 1 (the row-expansion affordance was missed during the first pass).</w:t>
+      </w:r>
+    </w:p>
+    <w:p>
+      <w:pPr>
+        <w:spacing w:after="60"/>
+        <w:ind w:left="230"/>
+      </w:pPr>
+      <w:r>
+        <w:rPr>
+          <w:b/>
+          <w:color w:val="1A1A1A"/>
+          <w:sz w:val="20"/>
+        </w:rPr>
+        <w:t xml:space="preserve">Round 2: </w:t>
+      </w:r>
+      <w:r>
+        <w:rPr>
+          <w:color w:val="1A1A1A"/>
+          <w:sz w:val="20"/>
+        </w:rPr>
+        <w:t>Each Team workload row has a chevron on the right (down-pointing when collapsed, right-pointing when expanded) that fades in on row hover. Clicking the chevron flips its direction and toggles aria-expanded between "true" and "false" on the button, but no drill-down panel renders below the row. The next DOM sibling of the row button is the next member's row button, with no expansion content in between. Verified on Harvey San Juan (589 tasks): aria-expanded becomes "true" but nothing appears underneath. The control implies a drill-down feature that isn't wired up.</w:t>
+      </w:r>
+    </w:p>
+    <w:p>
+      <w:pPr>
+        <w:spacing w:after="60"/>
+        <w:ind w:left="230"/>
+      </w:pPr>
+      <w:r>
+        <w:rPr>
+          <w:b/>
+          <w:color w:val="1A1A1A"/>
+          <w:sz w:val="20"/>
+        </w:rPr>
+        <w:t xml:space="preserve">What's left: </w:t>
+      </w:r>
+      <w:r>
+        <w:rPr>
+          <w:color w:val="1A1A1A"/>
+          <w:sz w:val="20"/>
+        </w:rPr>
+        <w:t>Either wire up the expansion panel or remove the chevron until the panel is ready. If shipping the panel: render the member's open tasks underneath the row when expanded, grouped by client · service, with each task showing title, status pill (TO DO / IN PROGRESS / WAITING), due date, and a quick link to open the card. Limit to 10 tasks initially with a "see all 589" link. If pulling the chevron: drop the button entirely from the row template so the affordance doesn't lie about what's behind it.</w:t>
+      </w:r>
+    </w:p>
+    <w:p>
+      <w:pPr>
+        <w:spacing w:after="40"/>
+      </w:pPr>
+    </w:p>
+    <w:p>
+      <w:pPr>
+        <w:spacing w:before="280" w:after="80"/>
+      </w:pPr>
+      <w:r>
+        <w:rPr>
+          <w:b/>
+          <w:color w:val="0077C8"/>
+          <w:sz w:val="30"/>
+        </w:rPr>
+        <w:t>Done</w:t>
+      </w:r>
+    </w:p>
+    <w:p>
+      <w:pPr>
+        <w:spacing w:after="120"/>
+        <w:pBdr>
+          <w:bottom w:val="single" w:sz="8" w:space="1" w:color="0077C8"/>
+        </w:pBdr>
+      </w:pPr>
+    </w:p>
+    <w:p>
+      <w:pPr>
+        <w:spacing w:after="120"/>
+      </w:pPr>
+      <w:r>
+        <w:rPr>
+          <w:color w:val="1A1A1A"/>
+          <w:sz w:val="21"/>
+        </w:rPr>
+        <w:t>Round 1 items the dev shipped between rounds. Listed for the record so we agree on what closed.</w:t>
       </w:r>
     </w:p>
     <w:tbl>
@@ -266,367 +683,6 @@
           <w:sz w:val="20"/>
         </w:rPr>
         <w:t>Portal now shows formatted strings: "Team Member", "SEO Specialist", "Manager" instead of the raw IDs. The render-layer fix is in. Done.</w:t>
-      </w:r>
-    </w:p>
-    <w:p>
-      <w:pPr>
-        <w:spacing w:after="40"/>
-      </w:pPr>
-    </w:p>
-    <w:p>
-      <w:pPr>
-        <w:spacing w:before="280" w:after="80"/>
-      </w:pPr>
-      <w:r>
-        <w:rPr>
-          <w:b/>
-          <w:color w:val="0077C8"/>
-          <w:sz w:val="30"/>
-        </w:rPr>
-        <w:t>New gaps spotted in Round 2</w:t>
-      </w:r>
-    </w:p>
-    <w:p>
-      <w:pPr>
-        <w:spacing w:after="120"/>
-        <w:pBdr>
-          <w:bottom w:val="single" w:sz="8" w:space="1" w:color="0077C8"/>
-        </w:pBdr>
-      </w:pPr>
-    </w:p>
-    <w:p>
-      <w:pPr>
-        <w:spacing w:after="120"/>
-      </w:pPr>
-      <w:r>
-        <w:rPr>
-          <w:color w:val="1A1A1A"/>
-          <w:sz w:val="21"/>
-        </w:rPr>
-        <w:t>Items that weren't on the Round 1 list, surfaced during this audit. Numbered to follow the existing list.</w:t>
-      </w:r>
-    </w:p>
-    <w:tbl>
-      <w:tblPr>
-        <w:tblW w:type="auto" w:w="0"/>
-        <w:tblLayout w:type="fixed"/>
-        <w:tblLook w:firstColumn="1" w:firstRow="1" w:lastColumn="0" w:lastRow="0" w:noHBand="0" w:noVBand="1" w:val="04A0"/>
-      </w:tblPr>
-      <w:tblGrid>
-        <w:gridCol w:w="792"/>
-        <w:gridCol w:w="1224"/>
-        <w:gridCol w:w="8064"/>
-      </w:tblGrid>
-      <w:tr>
-        <w:trPr>
-          <w:trHeight w:val="312"/>
-        </w:trPr>
-        <w:tc>
-          <w:tcPr>
-            <w:tcW w:type="dxa" w:w="792"/>
-            <w:tcBorders>
-              <w:top w:val="nil"/>
-              <w:left w:val="nil"/>
-              <w:bottom w:val="nil"/>
-              <w:right w:val="nil"/>
-            </w:tcBorders>
-            <w:shd w:val="clear" w:color="auto" w:fill="4A8F4A"/>
-            <w:vAlign w:val="center"/>
-          </w:tcPr>
-          <w:p>
-            <w:pPr>
-              <w:spacing w:after="0"/>
-              <w:jc w:val="center"/>
-            </w:pPr>
-            <w:r>
-              <w:rPr>
-                <w:b/>
-                <w:color w:val="FFFFFF"/>
-                <w:sz w:val="16"/>
-              </w:rPr>
-              <w:t>LOW</w:t>
-            </w:r>
-          </w:p>
-        </w:tc>
-        <w:tc>
-          <w:tcPr>
-            <w:tcW w:type="dxa" w:w="1224"/>
-            <w:tcBorders>
-              <w:top w:val="nil"/>
-              <w:left w:val="nil"/>
-              <w:bottom w:val="nil"/>
-              <w:right w:val="nil"/>
-            </w:tcBorders>
-            <w:shd w:val="clear" w:color="auto" w:fill="D33B3B"/>
-            <w:vAlign w:val="center"/>
-          </w:tcPr>
-          <w:p>
-            <w:pPr>
-              <w:spacing w:after="0"/>
-              <w:jc w:val="center"/>
-            </w:pPr>
-            <w:r>
-              <w:rPr>
-                <w:b/>
-                <w:color w:val="FFFFFF"/>
-                <w:sz w:val="16"/>
-              </w:rPr>
-              <w:t>OPEN</w:t>
-            </w:r>
-          </w:p>
-        </w:tc>
-        <w:tc>
-          <w:tcPr>
-            <w:tcW w:type="dxa" w:w="8064"/>
-            <w:tcBorders>
-              <w:top w:val="nil"/>
-              <w:left w:val="nil"/>
-              <w:bottom w:val="nil"/>
-              <w:right w:val="nil"/>
-            </w:tcBorders>
-            <w:vAlign w:val="center"/>
-          </w:tcPr>
-          <w:p>
-            <w:pPr>
-              <w:spacing w:after="0"/>
-            </w:pPr>
-            <w:r>
-              <w:rPr>
-                <w:b/>
-                <w:color w:val="1A1A1A"/>
-                <w:sz w:val="22"/>
-              </w:rPr>
-              <w:t>#2. Underlying labels use generic roles, not job titles</w:t>
-            </w:r>
-          </w:p>
-        </w:tc>
-      </w:tr>
-    </w:tbl>
-    <w:p>
-      <w:pPr>
-        <w:spacing w:after="60"/>
-        <w:ind w:left="230"/>
-      </w:pPr>
-      <w:r>
-        <w:rPr>
-          <w:b/>
-          <w:color w:val="1A1A1A"/>
-          <w:sz w:val="20"/>
-        </w:rPr>
-        <w:t xml:space="preserve">Round 1: </w:t>
-      </w:r>
-      <w:r>
-        <w:rPr>
-          <w:color w:val="1A1A1A"/>
-          <w:sz w:val="20"/>
-        </w:rPr>
-        <w:t>Not flagged in Round 1 (the formatting issue dominated).</w:t>
-      </w:r>
-    </w:p>
-    <w:p>
-      <w:pPr>
-        <w:spacing w:after="60"/>
-        <w:ind w:left="230"/>
-      </w:pPr>
-      <w:r>
-        <w:rPr>
-          <w:b/>
-          <w:color w:val="1A1A1A"/>
-          <w:sz w:val="20"/>
-        </w:rPr>
-        <w:t xml:space="preserve">Round 2: </w:t>
-      </w:r>
-      <w:r>
-        <w:rPr>
-          <w:color w:val="1A1A1A"/>
-          <w:sz w:val="20"/>
-        </w:rPr>
-        <w:t>Now that the display is fixed, a softer issue surfaces: the labels (Team Member, Manager, Admin, SEO Specialist) come from the user's access role, not a Job Titles catalog. Our build maps members to richer job titles (Account Manager, Web Designer, Senior Growth &amp; SEO Manager, Paid Social Manager, Operations Manager). The portal's data layer doesn't have a Job Titles catalog populated yet.</w:t>
-      </w:r>
-    </w:p>
-    <w:p>
-      <w:pPr>
-        <w:spacing w:after="60"/>
-        <w:ind w:left="230"/>
-      </w:pPr>
-      <w:r>
-        <w:rPr>
-          <w:b/>
-          <w:color w:val="1A1A1A"/>
-          <w:sz w:val="20"/>
-        </w:rPr>
-        <w:t xml:space="preserve">What's left: </w:t>
-      </w:r>
-      <w:r>
-        <w:rPr>
-          <w:color w:val="1A1A1A"/>
-          <w:sz w:val="20"/>
-        </w:rPr>
-        <w:t>Phase 2 work, mostly data not UI: build out a Job Titles catalog for the workspace, assign each team member to a title, render that title where role labels currently surface (Team workload, Anyone dropdown, Team Capacity heatmap, Client About &gt; Project Team). The display layer already supports rich labels. It's a matter of plumbing the catalog through.</w:t>
-      </w:r>
-    </w:p>
-    <w:p>
-      <w:pPr>
-        <w:spacing w:after="40"/>
-      </w:pPr>
-    </w:p>
-    <w:tbl>
-      <w:tblPr>
-        <w:tblW w:type="auto" w:w="0"/>
-        <w:tblLayout w:type="fixed"/>
-        <w:tblLook w:firstColumn="1" w:firstRow="1" w:lastColumn="0" w:lastRow="0" w:noHBand="0" w:noVBand="1" w:val="04A0"/>
-      </w:tblPr>
-      <w:tblGrid>
-        <w:gridCol w:w="792"/>
-        <w:gridCol w:w="1224"/>
-        <w:gridCol w:w="8064"/>
-      </w:tblGrid>
-      <w:tr>
-        <w:trPr>
-          <w:trHeight w:val="312"/>
-        </w:trPr>
-        <w:tc>
-          <w:tcPr>
-            <w:tcW w:type="dxa" w:w="792"/>
-            <w:tcBorders>
-              <w:top w:val="nil"/>
-              <w:left w:val="nil"/>
-              <w:bottom w:val="nil"/>
-              <w:right w:val="nil"/>
-            </w:tcBorders>
-            <w:shd w:val="clear" w:color="auto" w:fill="D33B3B"/>
-            <w:vAlign w:val="center"/>
-          </w:tcPr>
-          <w:p>
-            <w:pPr>
-              <w:spacing w:after="0"/>
-              <w:jc w:val="center"/>
-            </w:pPr>
-            <w:r>
-              <w:rPr>
-                <w:b/>
-                <w:color w:val="FFFFFF"/>
-                <w:sz w:val="16"/>
-              </w:rPr>
-              <w:t>HIGH</w:t>
-            </w:r>
-          </w:p>
-        </w:tc>
-        <w:tc>
-          <w:tcPr>
-            <w:tcW w:type="dxa" w:w="1224"/>
-            <w:tcBorders>
-              <w:top w:val="nil"/>
-              <w:left w:val="nil"/>
-              <w:bottom w:val="nil"/>
-              <w:right w:val="nil"/>
-            </w:tcBorders>
-            <w:shd w:val="clear" w:color="auto" w:fill="D33B3B"/>
-            <w:vAlign w:val="center"/>
-          </w:tcPr>
-          <w:p>
-            <w:pPr>
-              <w:spacing w:after="0"/>
-              <w:jc w:val="center"/>
-            </w:pPr>
-            <w:r>
-              <w:rPr>
-                <w:b/>
-                <w:color w:val="FFFFFF"/>
-                <w:sz w:val="16"/>
-              </w:rPr>
-              <w:t>OPEN</w:t>
-            </w:r>
-          </w:p>
-        </w:tc>
-        <w:tc>
-          <w:tcPr>
-            <w:tcW w:type="dxa" w:w="8064"/>
-            <w:tcBorders>
-              <w:top w:val="nil"/>
-              <w:left w:val="nil"/>
-              <w:bottom w:val="nil"/>
-              <w:right w:val="nil"/>
-            </w:tcBorders>
-            <w:vAlign w:val="center"/>
-          </w:tcPr>
-          <w:p>
-            <w:pPr>
-              <w:spacing w:after="0"/>
-            </w:pPr>
-            <w:r>
-              <w:rPr>
-                <w:b/>
-                <w:color w:val="1A1A1A"/>
-                <w:sz w:val="22"/>
-              </w:rPr>
-              <w:t>#3. Team workload row expansion toggles state but renders no drill-down</w:t>
-            </w:r>
-          </w:p>
-        </w:tc>
-      </w:tr>
-    </w:tbl>
-    <w:p>
-      <w:pPr>
-        <w:spacing w:after="60"/>
-        <w:ind w:left="230"/>
-      </w:pPr>
-      <w:r>
-        <w:rPr>
-          <w:b/>
-          <w:color w:val="1A1A1A"/>
-          <w:sz w:val="20"/>
-        </w:rPr>
-        <w:t xml:space="preserve">Round 1: </w:t>
-      </w:r>
-      <w:r>
-        <w:rPr>
-          <w:color w:val="1A1A1A"/>
-          <w:sz w:val="20"/>
-        </w:rPr>
-        <w:t>Not flagged in Round 1 (the row-expansion affordance was missed during the first pass).</w:t>
-      </w:r>
-    </w:p>
-    <w:p>
-      <w:pPr>
-        <w:spacing w:after="60"/>
-        <w:ind w:left="230"/>
-      </w:pPr>
-      <w:r>
-        <w:rPr>
-          <w:b/>
-          <w:color w:val="1A1A1A"/>
-          <w:sz w:val="20"/>
-        </w:rPr>
-        <w:t xml:space="preserve">Round 2: </w:t>
-      </w:r>
-      <w:r>
-        <w:rPr>
-          <w:color w:val="1A1A1A"/>
-          <w:sz w:val="20"/>
-        </w:rPr>
-        <w:t>Each Team workload row has a chevron on the right (▼ collapsed, ▶ expanded) that hovers in on the row. Clicking the chevron flips the chevron direction and toggles aria-expanded between "true" and "false" on the button, but no drill-down panel renders below the row. The next DOM sibling of the row button is the next member's row button, with no expansion content in between. Verified on Harvey San Juan (589 tasks): aria-expanded becomes "true" but nothing appears underneath. The control implies a drill-down feature that isn't wired up.</w:t>
-      </w:r>
-    </w:p>
-    <w:p>
-      <w:pPr>
-        <w:spacing w:after="60"/>
-        <w:ind w:left="230"/>
-      </w:pPr>
-      <w:r>
-        <w:rPr>
-          <w:b/>
-          <w:color w:val="1A1A1A"/>
-          <w:sz w:val="20"/>
-        </w:rPr>
-        <w:t xml:space="preserve">What's left: </w:t>
-      </w:r>
-      <w:r>
-        <w:rPr>
-          <w:color w:val="1A1A1A"/>
-          <w:sz w:val="20"/>
-        </w:rPr>
-        <w:t>Either wire up the expansion panel or remove the chevron until the panel is ready. If shipping the panel: render the member's open tasks underneath the row when expanded, grouped by client · service, with each task showing title, status pill (TO DO / IN PROGRESS / WAITING), due date, and a quick link to open the card. Limit to 10 tasks initially with a "see all 589" link. If pulling the chevron: drop the button entirely from the row template so the affordance doesn't lie about what's behind it.</w:t>
       </w:r>
     </w:p>
     <w:p>

</xml_diff>